<commit_message>
Shorten optional abstract to under 500 words
Co-Authored-By: Claude Sonnet 5.5 <noreply@anthropic.com>
Claude-Session: https://claude.ai/code/session_01BZjJPdbxvnVxMrcgFoYMCh
</commit_message>
<xml_diff>
--- a/misq_si/MISQ_SI_Optional_Abstract_DRAFT.docx
+++ b/misq_si/MISQ_SI_Optional_Abstract_DRAFT.docx
@@ -212,7 +212,7 @@
           <w:b w:val="0"/>
           <w:i w:val="0"/>
         </w:rPr>
-        <w:t xml:space="preserve"> Generative-AI testing tools are entering these projects. They change who can produce evidence of quality, how cheaply, and with what traceability. They also raise a question the existing ritual has no ready answer for: when an AI tool finds, or fails to find, a fault, whose act is that, and who signs? This makes the phenomenon visible. Tools that speed up testing may leave the ritual intact, hollow it out, or force it to be rewritten, and which of these happens is an empirical question.</w:t>
+        <w:t xml:space="preserve"> Generative-AI testing tools are entering these projects. They change who can produce evidence of quality, how cheaply, and with what traceability. They also raise a question the existing ritual has no ready answer for: when an AI tool finds, or fails to find, a fault, whose act is that, and who signs? Whether the ritual survives intact, is hollowed out, or is rewritten is an empirical question.</w:t>
       </w:r>
     </w:p>
     <w:p>
@@ -252,7 +252,7 @@
           <w:b w:val="0"/>
           <w:i w:val="0"/>
         </w:rPr>
-        <w:t xml:space="preserve"> An inductive, interpretive study built on [N] interviews with practitioners across the contracting chain and with auditors [number and access to be secured by the author], contract and inspection documents where access is possible, and observation of [acceptance meetings, if permitted]. The sensitizing categories above are starting points and will be dropped if informants do not use them. As a Discovery Short Paper, the contribution would be a rich account of the phenomenon and the constructs that emerge from it, as a basis for later theory and empirical work.</w:t>
+        <w:t xml:space="preserve"> An inductive, interpretive study built on [N] interviews with practitioners across the contracting chain and with auditors [number and access to be secured by the author], contract and inspection documents where access is possible, and observation of [acceptance meetings, if permitted]. The categories above are starting points and will be dropped if informants do not use them. As a Discovery Short Paper, the contribution is a rich account and the constructs that emerge from it.</w:t>
       </w:r>
     </w:p>
     <w:p>
@@ -272,27 +272,7 @@
           <w:b w:val="0"/>
           <w:i w:val="0"/>
         </w:rPr>
-        <w:t xml:space="preserve"> We expect to offer one or more new constructs describing how verification and responsibility are coupled in this setting [to be induced from data], and to show what they imply for IS theories of outsourcing, assurance and the governance of AI-assisted work. We will state explicitly what the account means for existing theory, so that it is more than a description. We will not claim that the constructs generalize; whether and where they apply is a question for later work.</w:t>
-      </w:r>
-    </w:p>
-    <w:p>
-      <w:pPr>
-        <w:spacing w:line="300" w:lineRule="auto" w:after="120" w:before="0"/>
-        <w:jc w:val="both"/>
-      </w:pPr>
-      <w:r>
-        <w:rPr>
-          <w:b/>
-          <w:i w:val="0"/>
-        </w:rPr>
-        <w:t>Fit with the special issue.</w:t>
-      </w:r>
-      <w:r>
-        <w:rPr>
-          <w:b w:val="0"/>
-          <w:i w:val="0"/>
-        </w:rPr>
-        <w:t xml:space="preserve"> The study asks what a distinctively Korean institutional arrangement is, on its own terms, and what theory it requires. It is not an application or extension of an existing Western theory to a new setting.</w:t>
+        <w:t xml:space="preserve"> We expect to offer one or more new constructs describing how verification and responsibility are coupled in this setting [to be induced from data], and to show what they imply for IS theories of outsourcing, assurance and the governance of AI-assisted work. We will state what the account means for existing theory, so that it is more than description, and will not assume the constructs generalize.</w:t>
       </w:r>
     </w:p>
     <w:sectPr>

</xml_diff>